<commit_message>
post work through tweaks
</commit_message>
<xml_diff>
--- a/Sermon notes.docx
+++ b/Sermon notes.docx
@@ -77,26 +77,16 @@
                 <w:sz w:val="16"/>
                 <w:szCs w:val="16"/>
               </w:rPr>
-              <w:t>2</w:t>
-            </w:r>
-            <w:r>
-              <w:rPr>
-                <w:i/>
-                <w:iCs/>
-                <w:sz w:val="16"/>
-                <w:szCs w:val="16"/>
-                <w:vertAlign w:val="superscript"/>
-              </w:rPr>
-              <w:t>nd</w:t>
-            </w:r>
-            <w:r>
-              <w:rPr>
-                <w:i/>
-                <w:iCs/>
-                <w:sz w:val="16"/>
-                <w:szCs w:val="16"/>
-              </w:rPr>
-              <w:t xml:space="preserve"> text</w:t>
+              <w:t xml:space="preserve">First </w:t>
+            </w:r>
+            <w:r>
+              <w:rPr>
+                <w:i/>
+                <w:iCs/>
+                <w:sz w:val="16"/>
+                <w:szCs w:val="16"/>
+              </w:rPr>
+              <w:t>text</w:t>
             </w:r>
           </w:p>
         </w:tc>
@@ -130,6 +120,13 @@
               </w:rPr>
               <w:t>Question</w:t>
             </w:r>
+            <w:r>
+              <w:rPr>
+                <w:sz w:val="16"/>
+                <w:szCs w:val="16"/>
+              </w:rPr>
+              <w:t>/Premise</w:t>
+            </w:r>
           </w:p>
         </w:tc>
         <w:tc>
@@ -198,26 +195,7 @@
                 <w:sz w:val="16"/>
                 <w:szCs w:val="16"/>
               </w:rPr>
-              <w:t>1</w:t>
-            </w:r>
-            <w:r>
-              <w:rPr>
-                <w:i/>
-                <w:iCs/>
-                <w:sz w:val="16"/>
-                <w:szCs w:val="16"/>
-                <w:vertAlign w:val="superscript"/>
-              </w:rPr>
-              <w:t>st</w:t>
-            </w:r>
-            <w:r>
-              <w:rPr>
-                <w:i/>
-                <w:iCs/>
-                <w:sz w:val="16"/>
-                <w:szCs w:val="16"/>
-              </w:rPr>
-              <w:t xml:space="preserve"> </w:t>
+              <w:t xml:space="preserve">Last </w:t>
             </w:r>
             <w:r>
               <w:rPr>
@@ -300,7 +278,21 @@
                 <w:sz w:val="16"/>
                 <w:szCs w:val="16"/>
               </w:rPr>
-              <w:t>Personal stories re image</w:t>
+              <w:t xml:space="preserve">3 x personal </w:t>
+            </w:r>
+            <w:r>
+              <w:rPr>
+                <w:sz w:val="16"/>
+                <w:szCs w:val="16"/>
+              </w:rPr>
+              <w:t>image</w:t>
+            </w:r>
+            <w:r>
+              <w:rPr>
+                <w:sz w:val="16"/>
+                <w:szCs w:val="16"/>
+              </w:rPr>
+              <w:t xml:space="preserve">s: Insta + Wiki + Guardian </w:t>
             </w:r>
           </w:p>
           <w:p>
@@ -328,7 +320,21 @@
                 <w:sz w:val="16"/>
                 <w:szCs w:val="16"/>
               </w:rPr>
-              <w:t>Fear re dark Wikipedia page.</w:t>
+              <w:t xml:space="preserve">Fear re dark </w:t>
+            </w:r>
+            <w:r>
+              <w:rPr>
+                <w:sz w:val="16"/>
+                <w:szCs w:val="16"/>
+              </w:rPr>
+              <w:t xml:space="preserve">Wiki </w:t>
+            </w:r>
+            <w:r>
+              <w:rPr>
+                <w:sz w:val="16"/>
+                <w:szCs w:val="16"/>
+              </w:rPr>
+              <w:t>page.</w:t>
             </w:r>
           </w:p>
         </w:tc>
@@ -389,21 +395,28 @@
                 <w:sz w:val="16"/>
                 <w:szCs w:val="16"/>
               </w:rPr>
-              <w:t>1. M</w:t>
-            </w:r>
-            <w:r>
-              <w:rPr>
-                <w:sz w:val="16"/>
-                <w:szCs w:val="16"/>
-              </w:rPr>
-              <w:t>atters</w:t>
-            </w:r>
-            <w:r>
-              <w:rPr>
-                <w:sz w:val="16"/>
-                <w:szCs w:val="16"/>
-              </w:rPr>
-              <w:t xml:space="preserve">; 2. </w:t>
+              <w:t xml:space="preserve">1. </w:t>
+            </w:r>
+            <w:r>
+              <w:rPr>
+                <w:sz w:val="16"/>
+                <w:szCs w:val="16"/>
+              </w:rPr>
+              <w:t xml:space="preserve">Immage </w:t>
+            </w:r>
+            <w:r>
+              <w:rPr>
+                <w:sz w:val="16"/>
+                <w:szCs w:val="16"/>
+              </w:rPr>
+              <w:t>matters</w:t>
+            </w:r>
+            <w:r>
+              <w:rPr>
+                <w:sz w:val="16"/>
+                <w:szCs w:val="16"/>
+              </w:rPr>
+              <w:t xml:space="preserve">. </w:t>
             </w:r>
           </w:p>
           <w:p>
@@ -426,15 +439,7 @@
                 <w:szCs w:val="16"/>
                 <w:u w:val="single"/>
               </w:rPr>
-              <w:t>Play C:</w:t>
-            </w:r>
-            <w:r>
-              <w:rPr>
-                <w:color w:val="EE0000"/>
-                <w:sz w:val="16"/>
-                <w:szCs w:val="16"/>
-              </w:rPr>
-              <w:t xml:space="preserve"> </w:t>
+              <w:t xml:space="preserve">2. </w:t>
             </w:r>
             <w:r>
               <w:rPr>
@@ -491,237 +496,6 @@
           <w:tcPr>
             <w:tcW w:w="14926" w:type="dxa"/>
             <w:gridSpan w:val="4"/>
-          </w:tcPr>
-          <w:p>
-            <w:r>
-              <w:rPr>
-                <w:i/>
-                <w:iCs/>
-                <w:sz w:val="16"/>
-                <w:szCs w:val="16"/>
-              </w:rPr>
-              <w:t xml:space="preserve">2 warnings: 1. </w:t>
-            </w:r>
-            <w:proofErr w:type="gramStart"/>
-            <w:r>
-              <w:rPr>
-                <w:i/>
-                <w:iCs/>
-                <w:sz w:val="16"/>
-                <w:szCs w:val="16"/>
-              </w:rPr>
-              <w:t>T</w:t>
-            </w:r>
-            <w:r>
-              <w:rPr>
-                <w:i/>
-                <w:iCs/>
-                <w:sz w:val="16"/>
-                <w:szCs w:val="16"/>
-              </w:rPr>
-              <w:t>alking</w:t>
-            </w:r>
-            <w:proofErr w:type="gramEnd"/>
-            <w:r>
-              <w:rPr>
-                <w:i/>
-                <w:iCs/>
-                <w:sz w:val="16"/>
-                <w:szCs w:val="16"/>
-              </w:rPr>
-              <w:t xml:space="preserve"> </w:t>
-            </w:r>
-            <w:proofErr w:type="gramStart"/>
-            <w:r>
-              <w:rPr>
-                <w:i/>
-                <w:iCs/>
-                <w:sz w:val="16"/>
-                <w:szCs w:val="16"/>
-              </w:rPr>
-              <w:t>lots</w:t>
-            </w:r>
-            <w:proofErr w:type="gramEnd"/>
-            <w:r>
-              <w:rPr>
-                <w:i/>
-                <w:iCs/>
-                <w:sz w:val="16"/>
-                <w:szCs w:val="16"/>
-              </w:rPr>
-              <w:t xml:space="preserve"> </w:t>
-            </w:r>
-            <w:r>
-              <w:rPr>
-                <w:i/>
-                <w:iCs/>
-                <w:sz w:val="16"/>
-                <w:szCs w:val="16"/>
-              </w:rPr>
-              <w:t>images</w:t>
-            </w:r>
-            <w:r>
-              <w:rPr>
-                <w:i/>
-                <w:iCs/>
-                <w:sz w:val="16"/>
-                <w:szCs w:val="16"/>
-              </w:rPr>
-              <w:t xml:space="preserve"> </w:t>
-            </w:r>
-            <w:proofErr w:type="gramStart"/>
-            <w:r>
-              <w:rPr>
-                <w:i/>
-                <w:iCs/>
-                <w:sz w:val="16"/>
-                <w:szCs w:val="16"/>
-              </w:rPr>
-              <w:t>so</w:t>
-            </w:r>
-            <w:proofErr w:type="gramEnd"/>
-            <w:r>
-              <w:rPr>
-                <w:i/>
-                <w:iCs/>
-                <w:sz w:val="16"/>
-                <w:szCs w:val="16"/>
-              </w:rPr>
-              <w:t xml:space="preserve"> l</w:t>
-            </w:r>
-            <w:r>
-              <w:rPr>
-                <w:i/>
-                <w:iCs/>
-                <w:sz w:val="16"/>
-                <w:szCs w:val="16"/>
-              </w:rPr>
-              <w:t xml:space="preserve">ots of images. </w:t>
-            </w:r>
-            <w:r>
-              <w:rPr>
-                <w:i/>
-                <w:iCs/>
-                <w:sz w:val="16"/>
-                <w:szCs w:val="16"/>
-              </w:rPr>
-              <w:t xml:space="preserve">2. </w:t>
-            </w:r>
-            <w:r>
-              <w:rPr>
-                <w:i/>
-                <w:iCs/>
-                <w:sz w:val="16"/>
-                <w:szCs w:val="16"/>
-              </w:rPr>
-              <w:t xml:space="preserve">Going on a journey to convey </w:t>
-            </w:r>
-            <w:r>
-              <w:rPr>
-                <w:i/>
-                <w:iCs/>
-                <w:sz w:val="16"/>
-                <w:szCs w:val="16"/>
-              </w:rPr>
-              <w:t>3 messages</w:t>
-            </w:r>
-            <w:r>
-              <w:rPr>
-                <w:i/>
-                <w:iCs/>
-                <w:sz w:val="16"/>
-                <w:szCs w:val="16"/>
-              </w:rPr>
-              <w:t xml:space="preserve"> Paul is saying</w:t>
-            </w:r>
-            <w:r>
-              <w:rPr>
-                <w:i/>
-                <w:iCs/>
-                <w:sz w:val="16"/>
-                <w:szCs w:val="16"/>
-              </w:rPr>
-              <w:t>: 1. Christ really = God. 2. Christ really = awesome. 3. Through Christ, we can be in God.</w:t>
-            </w:r>
-          </w:p>
-        </w:tc>
-      </w:tr>
-      <w:tr>
-        <w:tc>
-          <w:tcPr>
-            <w:tcW w:w="284" w:type="dxa"/>
-          </w:tcPr>
-          <w:p>
-            <w:pPr>
-              <w:ind w:left="-108" w:right="-80"/>
-              <w:jc w:val="center"/>
-              <w:rPr>
-                <w:sz w:val="16"/>
-                <w:szCs w:val="16"/>
-              </w:rPr>
-            </w:pPr>
-            <w:r>
-              <w:rPr>
-                <w:sz w:val="16"/>
-                <w:szCs w:val="16"/>
-              </w:rPr>
-              <w:t>2</w:t>
-            </w:r>
-          </w:p>
-        </w:tc>
-        <w:tc>
-          <w:tcPr>
-            <w:tcW w:w="3057" w:type="dxa"/>
-          </w:tcPr>
-          <w:p>
-            <w:pPr>
-              <w:rPr>
-                <w:b/>
-                <w:bCs/>
-                <w:i/>
-                <w:iCs/>
-                <w:sz w:val="16"/>
-                <w:szCs w:val="16"/>
-              </w:rPr>
-            </w:pPr>
-            <w:r>
-              <w:rPr>
-                <w:b/>
-                <w:bCs/>
-                <w:i/>
-                <w:iCs/>
-                <w:sz w:val="16"/>
-                <w:szCs w:val="16"/>
-              </w:rPr>
-              <w:t>Col 1:15</w:t>
-            </w:r>
-            <w:r>
-              <w:rPr>
-                <w:b/>
-                <w:bCs/>
-                <w:i/>
-                <w:iCs/>
-                <w:sz w:val="16"/>
-                <w:szCs w:val="16"/>
-              </w:rPr>
-              <w:t>_</w:t>
-            </w:r>
-            <w:r>
-              <w:rPr>
-                <w:b/>
-                <w:bCs/>
-                <w:i/>
-                <w:iCs/>
-                <w:sz w:val="16"/>
-                <w:szCs w:val="16"/>
-              </w:rPr>
-              <w:t>He is the image of the invisible God</w:t>
-            </w:r>
-          </w:p>
-        </w:tc>
-        <w:tc>
-          <w:tcPr>
-            <w:tcW w:w="3507" w:type="dxa"/>
           </w:tcPr>
           <w:p>
             <w:pPr>
@@ -741,6 +515,297 @@
                 <w:sz w:val="16"/>
                 <w:szCs w:val="16"/>
               </w:rPr>
+              <w:t xml:space="preserve">Warning 1: </w:t>
+            </w:r>
+            <w:r>
+              <w:rPr>
+                <w:sz w:val="16"/>
+                <w:szCs w:val="16"/>
+              </w:rPr>
+              <w:t xml:space="preserve"> </w:t>
+            </w:r>
+            <w:r>
+              <w:rPr>
+                <w:sz w:val="16"/>
+                <w:szCs w:val="16"/>
+              </w:rPr>
+              <w:t>T</w:t>
+            </w:r>
+            <w:r>
+              <w:rPr>
+                <w:sz w:val="16"/>
+                <w:szCs w:val="16"/>
+              </w:rPr>
+              <w:t xml:space="preserve">alking lots </w:t>
+            </w:r>
+            <w:r>
+              <w:rPr>
+                <w:sz w:val="16"/>
+                <w:szCs w:val="16"/>
+              </w:rPr>
+              <w:t xml:space="preserve">about </w:t>
+            </w:r>
+            <w:r>
+              <w:rPr>
+                <w:sz w:val="16"/>
+                <w:szCs w:val="16"/>
+              </w:rPr>
+              <w:t>images</w:t>
+            </w:r>
+            <w:r>
+              <w:rPr>
+                <w:sz w:val="16"/>
+                <w:szCs w:val="16"/>
+              </w:rPr>
+              <w:t xml:space="preserve"> </w:t>
+            </w:r>
+            <w:r>
+              <w:rPr>
+                <w:sz w:val="16"/>
+                <w:szCs w:val="16"/>
+              </w:rPr>
+              <w:sym w:font="Wingdings" w:char="F0E0"/>
+            </w:r>
+            <w:r>
+              <w:rPr>
+                <w:sz w:val="16"/>
+                <w:szCs w:val="16"/>
+              </w:rPr>
+              <w:t xml:space="preserve"> </w:t>
+            </w:r>
+            <w:r>
+              <w:rPr>
+                <w:sz w:val="16"/>
+                <w:szCs w:val="16"/>
+              </w:rPr>
+              <w:t>l</w:t>
+            </w:r>
+            <w:r>
+              <w:rPr>
+                <w:sz w:val="16"/>
+                <w:szCs w:val="16"/>
+              </w:rPr>
+              <w:t>ots of images.</w:t>
+            </w:r>
+          </w:p>
+          <w:p>
+            <w:pPr>
+              <w:pStyle w:val="ListParagraph"/>
+              <w:numPr>
+                <w:ilvl w:val="0"/>
+                <w:numId w:val="5"/>
+              </w:numPr>
+              <w:ind w:left="67" w:hanging="113"/>
+              <w:rPr>
+                <w:sz w:val="16"/>
+                <w:szCs w:val="16"/>
+              </w:rPr>
+            </w:pPr>
+            <w:r>
+              <w:rPr>
+                <w:sz w:val="16"/>
+                <w:szCs w:val="16"/>
+              </w:rPr>
+              <w:t>Warning</w:t>
+            </w:r>
+            <w:r>
+              <w:rPr>
+                <w:i/>
+                <w:iCs/>
+                <w:sz w:val="16"/>
+                <w:szCs w:val="16"/>
+              </w:rPr>
+              <w:t xml:space="preserve"> </w:t>
+            </w:r>
+            <w:r>
+              <w:rPr>
+                <w:i/>
+                <w:iCs/>
+                <w:sz w:val="16"/>
+                <w:szCs w:val="16"/>
+              </w:rPr>
+              <w:t xml:space="preserve"> </w:t>
+            </w:r>
+            <w:r>
+              <w:rPr>
+                <w:i/>
+                <w:iCs/>
+                <w:sz w:val="16"/>
+                <w:szCs w:val="16"/>
+              </w:rPr>
+              <w:t xml:space="preserve">2. </w:t>
+            </w:r>
+            <w:r>
+              <w:rPr>
+                <w:i/>
+                <w:iCs/>
+                <w:sz w:val="16"/>
+                <w:szCs w:val="16"/>
+              </w:rPr>
+              <w:t xml:space="preserve"> </w:t>
+            </w:r>
+            <w:r>
+              <w:rPr>
+                <w:i/>
+                <w:iCs/>
+                <w:sz w:val="16"/>
+                <w:szCs w:val="16"/>
+              </w:rPr>
+              <w:t xml:space="preserve">Going on a journey to convey </w:t>
+            </w:r>
+            <w:r>
+              <w:rPr>
+                <w:i/>
+                <w:iCs/>
+                <w:sz w:val="16"/>
+                <w:szCs w:val="16"/>
+              </w:rPr>
+              <w:t>3 messages</w:t>
+            </w:r>
+            <w:r>
+              <w:rPr>
+                <w:i/>
+                <w:iCs/>
+                <w:sz w:val="16"/>
+                <w:szCs w:val="16"/>
+              </w:rPr>
+              <w:t xml:space="preserve"> Paul is saying</w:t>
+            </w:r>
+            <w:r>
+              <w:rPr>
+                <w:i/>
+                <w:iCs/>
+                <w:sz w:val="16"/>
+                <w:szCs w:val="16"/>
+              </w:rPr>
+              <w:t>: 1. Christ really = God. 2. Christ really = awesome. 3. Through Christ, we can be in God.</w:t>
+            </w:r>
+          </w:p>
+        </w:tc>
+      </w:tr>
+      <w:tr>
+        <w:tc>
+          <w:tcPr>
+            <w:tcW w:w="284" w:type="dxa"/>
+          </w:tcPr>
+          <w:p>
+            <w:pPr>
+              <w:ind w:left="-108" w:right="-80"/>
+              <w:jc w:val="center"/>
+              <w:rPr>
+                <w:sz w:val="16"/>
+                <w:szCs w:val="16"/>
+              </w:rPr>
+            </w:pPr>
+            <w:r>
+              <w:rPr>
+                <w:sz w:val="16"/>
+                <w:szCs w:val="16"/>
+              </w:rPr>
+              <w:t>2</w:t>
+            </w:r>
+          </w:p>
+        </w:tc>
+        <w:tc>
+          <w:tcPr>
+            <w:tcW w:w="3057" w:type="dxa"/>
+          </w:tcPr>
+          <w:p>
+            <w:pPr>
+              <w:rPr>
+                <w:b/>
+                <w:bCs/>
+                <w:i/>
+                <w:iCs/>
+                <w:sz w:val="16"/>
+                <w:szCs w:val="16"/>
+              </w:rPr>
+            </w:pPr>
+            <w:r>
+              <w:rPr>
+                <w:b/>
+                <w:bCs/>
+                <w:i/>
+                <w:iCs/>
+                <w:sz w:val="16"/>
+                <w:szCs w:val="16"/>
+              </w:rPr>
+              <w:t>Col 1:15</w:t>
+            </w:r>
+            <w:r>
+              <w:rPr>
+                <w:b/>
+                <w:bCs/>
+                <w:i/>
+                <w:iCs/>
+                <w:sz w:val="16"/>
+                <w:szCs w:val="16"/>
+              </w:rPr>
+              <w:t>_</w:t>
+            </w:r>
+            <w:r>
+              <w:rPr>
+                <w:b/>
+                <w:bCs/>
+                <w:i/>
+                <w:iCs/>
+                <w:sz w:val="16"/>
+                <w:szCs w:val="16"/>
+              </w:rPr>
+              <w:t>He is the image of the invisible God</w:t>
+            </w:r>
+          </w:p>
+        </w:tc>
+        <w:tc>
+          <w:tcPr>
+            <w:tcW w:w="3507" w:type="dxa"/>
+          </w:tcPr>
+          <w:p>
+            <w:pPr>
+              <w:pStyle w:val="ListParagraph"/>
+              <w:numPr>
+                <w:ilvl w:val="0"/>
+                <w:numId w:val="5"/>
+              </w:numPr>
+              <w:ind w:left="67" w:hanging="113"/>
+              <w:rPr>
+                <w:sz w:val="16"/>
+                <w:szCs w:val="16"/>
+              </w:rPr>
+            </w:pPr>
+            <w:r>
+              <w:rPr>
+                <w:sz w:val="16"/>
+                <w:szCs w:val="16"/>
+              </w:rPr>
+              <w:t>Passage kicks off with this</w:t>
+            </w:r>
+            <w:r>
+              <w:rPr>
+                <w:sz w:val="16"/>
+                <w:szCs w:val="16"/>
+              </w:rPr>
+              <w:t xml:space="preserve"> = hook.</w:t>
+            </w:r>
+          </w:p>
+          <w:p>
+            <w:pPr>
+              <w:pStyle w:val="ListParagraph"/>
+              <w:numPr>
+                <w:ilvl w:val="0"/>
+                <w:numId w:val="5"/>
+              </w:numPr>
+              <w:ind w:left="67" w:hanging="113"/>
+              <w:rPr>
+                <w:sz w:val="16"/>
+                <w:szCs w:val="16"/>
+              </w:rPr>
+            </w:pPr>
+            <w:r>
+              <w:rPr>
+                <w:sz w:val="16"/>
+                <w:szCs w:val="16"/>
+              </w:rPr>
               <w:t>A</w:t>
             </w:r>
             <w:r>
@@ -755,37 +820,14 @@
                 <w:sz w:val="16"/>
                 <w:szCs w:val="16"/>
               </w:rPr>
-              <w:t xml:space="preserve">understanding </w:t>
-            </w:r>
-            <w:proofErr w:type="gramStart"/>
-            <w:r>
-              <w:rPr>
-                <w:sz w:val="16"/>
-                <w:szCs w:val="16"/>
-              </w:rPr>
-              <w:t xml:space="preserve">of </w:t>
-            </w:r>
-            <w:r>
-              <w:rPr>
-                <w:sz w:val="16"/>
-                <w:szCs w:val="16"/>
-              </w:rPr>
-              <w:t xml:space="preserve"> </w:t>
-            </w:r>
-            <w:r>
-              <w:rPr>
-                <w:sz w:val="16"/>
-                <w:szCs w:val="16"/>
-              </w:rPr>
-              <w:t>“</w:t>
-            </w:r>
-            <w:proofErr w:type="gramEnd"/>
-            <w:r>
-              <w:rPr>
-                <w:sz w:val="16"/>
-                <w:szCs w:val="16"/>
-              </w:rPr>
-              <w:t>eikon/</w:t>
+              <w:t xml:space="preserve">understanding of </w:t>
+            </w:r>
+            <w:r>
+              <w:rPr>
+                <w:sz w:val="16"/>
+                <w:szCs w:val="16"/>
+              </w:rPr>
+              <w:t>“eikon/</w:t>
             </w:r>
             <w:r>
               <w:rPr>
@@ -829,10 +871,43 @@
             </w:pPr>
             <w:r>
               <w:rPr>
-                <w:sz w:val="16"/>
-                <w:szCs w:val="16"/>
-              </w:rPr>
-              <w:t>United.</w:t>
+                <w:color w:val="EE0000"/>
+                <w:sz w:val="16"/>
+                <w:szCs w:val="16"/>
+              </w:rPr>
+              <w:t>Present</w:t>
+            </w:r>
+            <w:r>
+              <w:rPr>
+                <w:color w:val="EE0000"/>
+                <w:sz w:val="16"/>
+                <w:szCs w:val="16"/>
+              </w:rPr>
+              <w:t xml:space="preserve"> + </w:t>
+            </w:r>
+            <w:r>
+              <w:rPr>
+                <w:color w:val="EE0000"/>
+                <w:sz w:val="16"/>
+                <w:szCs w:val="16"/>
+              </w:rPr>
+              <w:t xml:space="preserve">Full power </w:t>
+            </w:r>
+            <w:r>
+              <w:rPr>
+                <w:color w:val="EE0000"/>
+                <w:sz w:val="16"/>
+                <w:szCs w:val="16"/>
+              </w:rPr>
+              <w:t xml:space="preserve">+ </w:t>
+            </w:r>
+            <w:r>
+              <w:rPr>
+                <w:color w:val="EE0000"/>
+                <w:sz w:val="16"/>
+                <w:szCs w:val="16"/>
+              </w:rPr>
+              <w:t>United</w:t>
             </w:r>
           </w:p>
         </w:tc>
@@ -856,27 +931,16 @@
                 <w:sz w:val="16"/>
                 <w:szCs w:val="16"/>
               </w:rPr>
-              <w:t>Image (</w:t>
-            </w:r>
-            <w:proofErr w:type="spellStart"/>
-            <w:r>
-              <w:rPr>
-                <w:b/>
-                <w:bCs/>
-                <w:sz w:val="16"/>
-                <w:szCs w:val="16"/>
-              </w:rPr>
-              <w:t>Eikōn</w:t>
-            </w:r>
-            <w:proofErr w:type="spellEnd"/>
-            <w:r>
-              <w:rPr>
-                <w:b/>
-                <w:bCs/>
-                <w:sz w:val="16"/>
-                <w:szCs w:val="16"/>
-              </w:rPr>
-              <w:t>) = reality?</w:t>
+              <w:t>Image (Eikōn) = reality</w:t>
+            </w:r>
+            <w:r>
+              <w:rPr>
+                <w:b/>
+                <w:bCs/>
+                <w:sz w:val="16"/>
+                <w:szCs w:val="16"/>
+              </w:rPr>
+              <w:t>.</w:t>
             </w:r>
           </w:p>
         </w:tc>
@@ -1259,23 +1323,7 @@
                 <w:sz w:val="16"/>
                 <w:szCs w:val="16"/>
               </w:rPr>
-              <w:t xml:space="preserve">Christ = </w:t>
-            </w:r>
-            <w:proofErr w:type="gramStart"/>
-            <w:r>
-              <w:rPr>
-                <w:sz w:val="16"/>
-                <w:szCs w:val="16"/>
-              </w:rPr>
-              <w:t>principle</w:t>
-            </w:r>
-            <w:proofErr w:type="gramEnd"/>
-            <w:r>
-              <w:rPr>
-                <w:sz w:val="16"/>
-                <w:szCs w:val="16"/>
-              </w:rPr>
-              <w:t xml:space="preserve"> agent of creation </w:t>
+              <w:t xml:space="preserve">Christ = principle agent of creation </w:t>
             </w:r>
           </w:p>
           <w:p>
@@ -1287,19 +1335,46 @@
               </w:numPr>
               <w:ind w:left="69" w:hanging="111"/>
               <w:rPr>
-                <w:sz w:val="16"/>
-                <w:szCs w:val="16"/>
-              </w:rPr>
-            </w:pPr>
-            <w:r>
-              <w:rPr>
-                <w:sz w:val="16"/>
-                <w:szCs w:val="16"/>
-              </w:rPr>
-              <w:t xml:space="preserve">Method: Language </w:t>
-            </w:r>
-            <w:r>
-              <w:rPr>
+                <w:color w:val="EE0000"/>
+                <w:sz w:val="16"/>
+                <w:szCs w:val="16"/>
+              </w:rPr>
+            </w:pPr>
+            <w:r>
+              <w:rPr>
+                <w:color w:val="EE0000"/>
+                <w:sz w:val="16"/>
+                <w:szCs w:val="16"/>
+              </w:rPr>
+              <w:t>Bible’s m</w:t>
+            </w:r>
+            <w:r>
+              <w:rPr>
+                <w:color w:val="EE0000"/>
+                <w:sz w:val="16"/>
+                <w:szCs w:val="16"/>
+              </w:rPr>
+              <w:t>ethod</w:t>
+            </w:r>
+            <w:r>
+              <w:rPr>
+                <w:color w:val="EE0000"/>
+                <w:sz w:val="16"/>
+                <w:szCs w:val="16"/>
+              </w:rPr>
+              <w:t xml:space="preserve"> of creation</w:t>
+            </w:r>
+            <w:r>
+              <w:rPr>
+                <w:color w:val="EE0000"/>
+                <w:sz w:val="16"/>
+                <w:szCs w:val="16"/>
+              </w:rPr>
+              <w:t xml:space="preserve">: Language </w:t>
+            </w:r>
+            <w:r>
+              <w:rPr>
+                <w:color w:val="EE0000"/>
                 <w:sz w:val="16"/>
                 <w:szCs w:val="16"/>
               </w:rPr>
@@ -1307,6 +1382,7 @@
             </w:r>
             <w:r>
               <w:rPr>
+                <w:color w:val="EE0000"/>
                 <w:sz w:val="16"/>
                 <w:szCs w:val="16"/>
               </w:rPr>
@@ -1401,7 +1477,14 @@
                 <w:sz w:val="16"/>
                 <w:szCs w:val="16"/>
               </w:rPr>
-              <w:t xml:space="preserve">Stories </w:t>
+              <w:t>Stories</w:t>
+            </w:r>
+            <w:r>
+              <w:rPr>
+                <w:sz w:val="16"/>
+                <w:szCs w:val="16"/>
+              </w:rPr>
+              <w:t>.</w:t>
             </w:r>
           </w:p>
         </w:tc>
@@ -1451,31 +1534,7 @@
                 <w:sz w:val="16"/>
                 <w:szCs w:val="16"/>
               </w:rPr>
-              <w:t xml:space="preserve">In the beginning was the Word, and the Word was with God, and the Word was God. All things were </w:t>
-            </w:r>
-            <w:proofErr w:type="gramStart"/>
-            <w:r>
-              <w:rPr>
-                <w:b/>
-                <w:bCs/>
-                <w:i/>
-                <w:iCs/>
-                <w:sz w:val="16"/>
-                <w:szCs w:val="16"/>
-              </w:rPr>
-              <w:t>made</w:t>
-            </w:r>
-            <w:proofErr w:type="gramEnd"/>
-            <w:r>
-              <w:rPr>
-                <w:b/>
-                <w:bCs/>
-                <w:i/>
-                <w:iCs/>
-                <w:sz w:val="16"/>
-                <w:szCs w:val="16"/>
-              </w:rPr>
-              <w:t xml:space="preserve"> through him.</w:t>
+              <w:t>In the beginning was the Word, and the Word was with God, and the Word was God. All things were made through him.</w:t>
             </w:r>
           </w:p>
         </w:tc>
@@ -1610,6 +1669,35 @@
               </w:rPr>
               <w:t>esus.</w:t>
             </w:r>
+            <w:r>
+              <w:rPr>
+                <w:color w:val="EE0000"/>
+                <w:sz w:val="16"/>
+                <w:szCs w:val="16"/>
+              </w:rPr>
+              <w:t xml:space="preserve"> </w:t>
+            </w:r>
+          </w:p>
+          <w:p>
+            <w:pPr>
+              <w:pStyle w:val="ListParagraph"/>
+              <w:numPr>
+                <w:ilvl w:val="0"/>
+                <w:numId w:val="5"/>
+              </w:numPr>
+              <w:ind w:left="69" w:hanging="111"/>
+              <w:rPr>
+                <w:sz w:val="16"/>
+                <w:szCs w:val="16"/>
+              </w:rPr>
+            </w:pPr>
+            <w:r>
+              <w:rPr>
+                <w:sz w:val="16"/>
+                <w:szCs w:val="16"/>
+              </w:rPr>
+              <w:t>Fulfils every law + prophecy + promise</w:t>
+            </w:r>
           </w:p>
         </w:tc>
         <w:tc>
@@ -1658,31 +1746,7 @@
                 <w:sz w:val="16"/>
                 <w:szCs w:val="16"/>
               </w:rPr>
-              <w:t xml:space="preserve">And the Word became </w:t>
-            </w:r>
-            <w:proofErr w:type="gramStart"/>
-            <w:r>
-              <w:rPr>
-                <w:b/>
-                <w:bCs/>
-                <w:i/>
-                <w:iCs/>
-                <w:sz w:val="16"/>
-                <w:szCs w:val="16"/>
-              </w:rPr>
-              <w:t>flesh</w:t>
-            </w:r>
-            <w:proofErr w:type="gramEnd"/>
-            <w:r>
-              <w:rPr>
-                <w:b/>
-                <w:bCs/>
-                <w:i/>
-                <w:iCs/>
-                <w:sz w:val="16"/>
-                <w:szCs w:val="16"/>
-              </w:rPr>
-              <w:t xml:space="preserve"> and dwelt among us.</w:t>
+              <w:t>And the Word became flesh and dwelt among us.</w:t>
             </w:r>
           </w:p>
         </w:tc>
@@ -1734,31 +1798,7 @@
                 <w:sz w:val="16"/>
                 <w:szCs w:val="16"/>
               </w:rPr>
-              <w:t xml:space="preserve">John 14:8_Philip said to him, “Lord, show us the </w:t>
-            </w:r>
-            <w:proofErr w:type="gramStart"/>
-            <w:r>
-              <w:rPr>
-                <w:b/>
-                <w:bCs/>
-                <w:i/>
-                <w:iCs/>
-                <w:sz w:val="16"/>
-                <w:szCs w:val="16"/>
-              </w:rPr>
-              <w:t>Father</w:t>
-            </w:r>
-            <w:proofErr w:type="gramEnd"/>
-            <w:r>
-              <w:rPr>
-                <w:b/>
-                <w:bCs/>
-                <w:i/>
-                <w:iCs/>
-                <w:sz w:val="16"/>
-                <w:szCs w:val="16"/>
-              </w:rPr>
-              <w:t>, and it is enough for us.”</w:t>
+              <w:t>John 14:8_Philip said to him, “Lord, show us the Father, and it is enough for us.”</w:t>
             </w:r>
           </w:p>
         </w:tc>
@@ -1784,42 +1824,21 @@
                 <w:sz w:val="16"/>
                 <w:szCs w:val="16"/>
               </w:rPr>
-              <w:t xml:space="preserve">God </w:t>
-            </w:r>
-            <w:r>
-              <w:rPr>
-                <w:sz w:val="16"/>
-                <w:szCs w:val="16"/>
-              </w:rPr>
-              <w:sym w:font="Wingdings" w:char="F0E0"/>
-            </w:r>
-            <w:r>
-              <w:rPr>
-                <w:sz w:val="16"/>
-                <w:szCs w:val="16"/>
-              </w:rPr>
-              <w:t xml:space="preserve"> </w:t>
-            </w:r>
-            <w:r>
-              <w:rPr>
-                <w:sz w:val="16"/>
-                <w:szCs w:val="16"/>
-              </w:rPr>
-              <w:t>flesh</w:t>
-            </w:r>
-            <w:r>
-              <w:rPr>
-                <w:sz w:val="16"/>
-                <w:szCs w:val="16"/>
-              </w:rPr>
-              <w:t xml:space="preserve">: </w:t>
-            </w:r>
-            <w:r>
-              <w:rPr>
-                <w:sz w:val="16"/>
-                <w:szCs w:val="16"/>
-              </w:rPr>
-              <w:t>What’s going on here?</w:t>
+              <w:t xml:space="preserve">How come someone who’s been with God for 3 years can’t recognize </w:t>
+            </w:r>
+            <w:r>
+              <w:rPr>
+                <w:sz w:val="16"/>
+                <w:szCs w:val="16"/>
+              </w:rPr>
+              <w:t>who he really is</w:t>
+            </w:r>
+            <w:r>
+              <w:rPr>
+                <w:sz w:val="16"/>
+                <w:szCs w:val="16"/>
+              </w:rPr>
+              <w:t>?</w:t>
             </w:r>
           </w:p>
         </w:tc>
@@ -1845,79 +1864,14 @@
                 <w:sz w:val="16"/>
                 <w:szCs w:val="16"/>
               </w:rPr>
-              <w:t>Inside-</w:t>
-            </w:r>
-            <w:proofErr w:type="spellStart"/>
-            <w:r>
-              <w:rPr>
-                <w:sz w:val="16"/>
-                <w:szCs w:val="16"/>
-              </w:rPr>
-              <w:t>outy</w:t>
-            </w:r>
-            <w:proofErr w:type="spellEnd"/>
-            <w:r>
-              <w:rPr>
-                <w:sz w:val="16"/>
-                <w:szCs w:val="16"/>
-              </w:rPr>
-              <w:t>!</w:t>
-            </w:r>
-            <w:r>
-              <w:rPr>
-                <w:sz w:val="16"/>
-                <w:szCs w:val="16"/>
-              </w:rPr>
-              <w:t xml:space="preserve"> </w:t>
-            </w:r>
-            <w:r>
-              <w:rPr>
-                <w:sz w:val="16"/>
-                <w:szCs w:val="16"/>
-              </w:rPr>
-              <w:sym w:font="Wingdings" w:char="F0E0"/>
-            </w:r>
-            <w:r>
-              <w:rPr>
-                <w:sz w:val="16"/>
-                <w:szCs w:val="16"/>
-              </w:rPr>
-              <w:t xml:space="preserve"> </w:t>
-            </w:r>
-            <w:r>
-              <w:rPr>
-                <w:sz w:val="16"/>
-                <w:szCs w:val="16"/>
-              </w:rPr>
-              <w:t>Christ = visible image</w:t>
-            </w:r>
-            <w:r>
-              <w:rPr>
-                <w:sz w:val="16"/>
-                <w:szCs w:val="16"/>
-              </w:rPr>
-              <w:t xml:space="preserve">; </w:t>
-            </w:r>
-            <w:r>
-              <w:rPr>
-                <w:sz w:val="16"/>
-                <w:szCs w:val="16"/>
-              </w:rPr>
-              <w:t xml:space="preserve">God hidden </w:t>
-            </w:r>
-            <w:r>
-              <w:rPr>
-                <w:sz w:val="16"/>
-                <w:szCs w:val="16"/>
-              </w:rPr>
-              <w:t xml:space="preserve">in </w:t>
-            </w:r>
-            <w:r>
-              <w:rPr>
-                <w:sz w:val="16"/>
-                <w:szCs w:val="16"/>
-              </w:rPr>
-              <w:t>him.</w:t>
+              <w:t>Can’t see the Father without the Holy Spirit</w:t>
+            </w:r>
+            <w:r>
+              <w:rPr>
+                <w:sz w:val="16"/>
+                <w:szCs w:val="16"/>
+              </w:rPr>
+              <w:t xml:space="preserve"> = blocking layer</w:t>
             </w:r>
           </w:p>
           <w:p>
@@ -1935,6 +1889,111 @@
             </w:pPr>
             <w:r>
               <w:rPr>
+                <w:sz w:val="16"/>
+                <w:szCs w:val="16"/>
+              </w:rPr>
+              <w:t>Inside-outy</w:t>
+            </w:r>
+            <w:r>
+              <w:rPr>
+                <w:sz w:val="16"/>
+                <w:szCs w:val="16"/>
+              </w:rPr>
+              <w:t>!</w:t>
+            </w:r>
+            <w:r>
+              <w:rPr>
+                <w:sz w:val="16"/>
+                <w:szCs w:val="16"/>
+              </w:rPr>
+              <w:t xml:space="preserve"> </w:t>
+            </w:r>
+            <w:r>
+              <w:rPr>
+                <w:sz w:val="16"/>
+                <w:szCs w:val="16"/>
+              </w:rPr>
+              <w:sym w:font="Wingdings" w:char="F0E0"/>
+            </w:r>
+            <w:r>
+              <w:rPr>
+                <w:sz w:val="16"/>
+                <w:szCs w:val="16"/>
+              </w:rPr>
+              <w:t xml:space="preserve"> </w:t>
+            </w:r>
+            <w:r>
+              <w:rPr>
+                <w:sz w:val="16"/>
+                <w:szCs w:val="16"/>
+              </w:rPr>
+              <w:t xml:space="preserve">Father </w:t>
+            </w:r>
+            <w:r>
+              <w:rPr>
+                <w:sz w:val="16"/>
+                <w:szCs w:val="16"/>
+              </w:rPr>
+              <w:t xml:space="preserve">hid </w:t>
+            </w:r>
+            <w:r>
+              <w:rPr>
+                <w:sz w:val="16"/>
+                <w:szCs w:val="16"/>
+              </w:rPr>
+              <w:t xml:space="preserve">in </w:t>
+            </w:r>
+            <w:r>
+              <w:rPr>
+                <w:sz w:val="16"/>
+                <w:szCs w:val="16"/>
+              </w:rPr>
+              <w:t>Christ</w:t>
+            </w:r>
+            <w:r>
+              <w:rPr>
+                <w:sz w:val="16"/>
+                <w:szCs w:val="16"/>
+              </w:rPr>
+              <w:t xml:space="preserve">; </w:t>
+            </w:r>
+            <w:r>
+              <w:rPr>
+                <w:sz w:val="16"/>
+                <w:szCs w:val="16"/>
+              </w:rPr>
+              <w:t xml:space="preserve">Christ = visible </w:t>
+            </w:r>
+            <w:r>
+              <w:rPr>
+                <w:sz w:val="16"/>
+                <w:szCs w:val="16"/>
+              </w:rPr>
+              <w:t>image</w:t>
+            </w:r>
+            <w:r>
+              <w:rPr>
+                <w:sz w:val="16"/>
+                <w:szCs w:val="16"/>
+              </w:rPr>
+              <w:t>.</w:t>
+            </w:r>
+          </w:p>
+          <w:p>
+            <w:pPr>
+              <w:pStyle w:val="ListParagraph"/>
+              <w:numPr>
+                <w:ilvl w:val="0"/>
+                <w:numId w:val="5"/>
+              </w:numPr>
+              <w:ind w:left="69" w:hanging="111"/>
+              <w:rPr>
+                <w:sz w:val="16"/>
+                <w:szCs w:val="16"/>
+              </w:rPr>
+            </w:pPr>
+            <w:r>
+              <w:rPr>
                 <w:color w:val="EE0000"/>
                 <w:sz w:val="16"/>
                 <w:szCs w:val="16"/>
@@ -1947,7 +2006,31 @@
                 <w:sz w:val="16"/>
                 <w:szCs w:val="16"/>
               </w:rPr>
-              <w:t>meeting</w:t>
+              <w:t>chat</w:t>
+            </w:r>
+            <w:r>
+              <w:rPr>
+                <w:color w:val="EE0000"/>
+                <w:sz w:val="16"/>
+                <w:szCs w:val="16"/>
+              </w:rPr>
+              <w:t xml:space="preserve">: </w:t>
+            </w:r>
+            <w:r>
+              <w:rPr>
+                <w:color w:val="EE0000"/>
+                <w:sz w:val="16"/>
+                <w:szCs w:val="16"/>
+              </w:rPr>
+              <w:t xml:space="preserve">Christ </w:t>
+            </w:r>
+            <w:r>
+              <w:rPr>
+                <w:color w:val="EE0000"/>
+                <w:sz w:val="16"/>
+                <w:szCs w:val="16"/>
+              </w:rPr>
+              <w:t>= incredulous</w:t>
             </w:r>
             <w:r>
               <w:rPr>
@@ -1979,15 +2062,32 @@
                 <w:sz w:val="16"/>
                 <w:szCs w:val="16"/>
               </w:rPr>
-              <w:t xml:space="preserve">Christ </w:t>
-            </w:r>
-            <w:r>
-              <w:rPr>
-                <w:color w:val="EE0000"/>
-                <w:sz w:val="16"/>
-                <w:szCs w:val="16"/>
-              </w:rPr>
-              <w:t>= incredulous</w:t>
+              <w:t xml:space="preserve">Father + </w:t>
+            </w:r>
+            <w:r>
+              <w:rPr>
+                <w:color w:val="EE0000"/>
+                <w:sz w:val="16"/>
+                <w:szCs w:val="16"/>
+              </w:rPr>
+              <w:t xml:space="preserve">Spirit so </w:t>
+            </w:r>
+            <w:r>
+              <w:rPr>
+                <w:color w:val="EE0000"/>
+                <w:sz w:val="16"/>
+                <w:szCs w:val="16"/>
+                <w:u w:val="single"/>
+              </w:rPr>
+              <w:t>close</w:t>
+            </w:r>
+            <w:r>
+              <w:rPr>
+                <w:color w:val="EE0000"/>
+                <w:sz w:val="16"/>
+                <w:szCs w:val="16"/>
+              </w:rPr>
+              <w:t xml:space="preserve"> </w:t>
             </w:r>
           </w:p>
         </w:tc>
@@ -2015,103 +2115,7 @@
                 <w:sz w:val="16"/>
                 <w:szCs w:val="16"/>
               </w:rPr>
-              <w:t xml:space="preserve">“Whoever has seen me has seen the </w:t>
-            </w:r>
-            <w:proofErr w:type="gramStart"/>
-            <w:r>
-              <w:rPr>
-                <w:b/>
-                <w:bCs/>
-                <w:i/>
-                <w:iCs/>
-                <w:sz w:val="16"/>
-                <w:szCs w:val="16"/>
-              </w:rPr>
-              <w:t>Father</w:t>
-            </w:r>
-            <w:proofErr w:type="gramEnd"/>
-            <w:r>
-              <w:rPr>
-                <w:b/>
-                <w:bCs/>
-                <w:i/>
-                <w:iCs/>
-                <w:sz w:val="16"/>
-                <w:szCs w:val="16"/>
-              </w:rPr>
-              <w:t xml:space="preserve">. How can you say, ‘Show us the </w:t>
-            </w:r>
-            <w:proofErr w:type="gramStart"/>
-            <w:r>
-              <w:rPr>
-                <w:b/>
-                <w:bCs/>
-                <w:i/>
-                <w:iCs/>
-                <w:sz w:val="16"/>
-                <w:szCs w:val="16"/>
-              </w:rPr>
-              <w:t>Father</w:t>
-            </w:r>
-            <w:proofErr w:type="gramEnd"/>
-            <w:r>
-              <w:rPr>
-                <w:b/>
-                <w:bCs/>
-                <w:i/>
-                <w:iCs/>
-                <w:sz w:val="16"/>
-                <w:szCs w:val="16"/>
-              </w:rPr>
-              <w:t xml:space="preserve">’? Do you not believe that I am in the </w:t>
-            </w:r>
-            <w:proofErr w:type="gramStart"/>
-            <w:r>
-              <w:rPr>
-                <w:b/>
-                <w:bCs/>
-                <w:i/>
-                <w:iCs/>
-                <w:sz w:val="16"/>
-                <w:szCs w:val="16"/>
-              </w:rPr>
-              <w:t>Father</w:t>
-            </w:r>
-            <w:proofErr w:type="gramEnd"/>
-            <w:r>
-              <w:rPr>
-                <w:b/>
-                <w:bCs/>
-                <w:i/>
-                <w:iCs/>
-                <w:sz w:val="16"/>
-                <w:szCs w:val="16"/>
-              </w:rPr>
-              <w:t xml:space="preserve"> and the </w:t>
-            </w:r>
-            <w:proofErr w:type="gramStart"/>
-            <w:r>
-              <w:rPr>
-                <w:b/>
-                <w:bCs/>
-                <w:i/>
-                <w:iCs/>
-                <w:sz w:val="16"/>
-                <w:szCs w:val="16"/>
-              </w:rPr>
-              <w:t>Father</w:t>
-            </w:r>
-            <w:proofErr w:type="gramEnd"/>
-            <w:r>
-              <w:rPr>
-                <w:b/>
-                <w:bCs/>
-                <w:i/>
-                <w:iCs/>
-                <w:sz w:val="16"/>
-                <w:szCs w:val="16"/>
-              </w:rPr>
-              <w:t xml:space="preserve"> is in me?”</w:t>
+              <w:t>“Whoever has seen me has seen the Father. How can you say, ‘Show us the Father’? Do you not believe that I am in the Father and the Father is in me?”</w:t>
             </w:r>
           </w:p>
         </w:tc>
@@ -2228,58 +2232,79 @@
                 <w:sz w:val="16"/>
                 <w:szCs w:val="16"/>
               </w:rPr>
+              <w:t xml:space="preserve"> stoop</w:t>
+            </w:r>
+            <w:r>
+              <w:rPr>
+                <w:sz w:val="16"/>
+                <w:szCs w:val="16"/>
+              </w:rPr>
+              <w:t xml:space="preserve"> to humanity? </w:t>
+            </w:r>
+            <w:r>
+              <w:rPr>
+                <w:sz w:val="16"/>
+                <w:szCs w:val="16"/>
+              </w:rPr>
+              <w:t>No AC</w:t>
+            </w:r>
+            <w:r>
+              <w:rPr>
+                <w:sz w:val="16"/>
+                <w:szCs w:val="16"/>
+              </w:rPr>
+              <w:t>/</w:t>
+            </w:r>
+            <w:r>
+              <w:rPr>
+                <w:sz w:val="16"/>
+                <w:szCs w:val="16"/>
+              </w:rPr>
+              <w:t>toilets</w:t>
+            </w:r>
+            <w:r>
+              <w:rPr>
+                <w:sz w:val="16"/>
+                <w:szCs w:val="16"/>
+              </w:rPr>
+              <w:t>!</w:t>
+            </w:r>
+            <w:r>
+              <w:rPr>
+                <w:sz w:val="16"/>
+                <w:szCs w:val="16"/>
+              </w:rPr>
               <w:t xml:space="preserve"> </w:t>
             </w:r>
-            <w:proofErr w:type="gramStart"/>
-            <w:r>
-              <w:rPr>
-                <w:sz w:val="16"/>
-                <w:szCs w:val="16"/>
-              </w:rPr>
-              <w:t>stoop</w:t>
-            </w:r>
-            <w:proofErr w:type="gramEnd"/>
-            <w:r>
-              <w:rPr>
-                <w:sz w:val="16"/>
-                <w:szCs w:val="16"/>
-              </w:rPr>
-              <w:t xml:space="preserve"> to humanity? </w:t>
-            </w:r>
-            <w:r>
-              <w:rPr>
-                <w:sz w:val="16"/>
-                <w:szCs w:val="16"/>
-              </w:rPr>
-              <w:t>No AC</w:t>
-            </w:r>
-            <w:r>
-              <w:rPr>
-                <w:sz w:val="16"/>
-                <w:szCs w:val="16"/>
-              </w:rPr>
-              <w:t xml:space="preserve">, </w:t>
-            </w:r>
-            <w:r>
-              <w:rPr>
-                <w:sz w:val="16"/>
-                <w:szCs w:val="16"/>
-              </w:rPr>
-              <w:t>toilets</w:t>
-            </w:r>
-            <w:r>
-              <w:rPr>
-                <w:sz w:val="16"/>
-                <w:szCs w:val="16"/>
-              </w:rPr>
-              <w:t>!</w:t>
-            </w:r>
-            <w:r>
-              <w:rPr>
-                <w:sz w:val="16"/>
-                <w:szCs w:val="16"/>
-              </w:rPr>
-              <w:t xml:space="preserve"> </w:t>
+          </w:p>
+          <w:p>
+            <w:pPr>
+              <w:pStyle w:val="ListParagraph"/>
+              <w:numPr>
+                <w:ilvl w:val="0"/>
+                <w:numId w:val="5"/>
+              </w:numPr>
+              <w:ind w:left="67" w:hanging="113"/>
+              <w:rPr>
+                <w:sz w:val="16"/>
+                <w:szCs w:val="16"/>
+              </w:rPr>
+            </w:pPr>
+            <w:r>
+              <w:rPr>
+                <w:sz w:val="16"/>
+                <w:szCs w:val="16"/>
+                <w:u w:val="single"/>
+              </w:rPr>
+              <w:t xml:space="preserve">Also, we (often) suck: </w:t>
+            </w:r>
+            <w:r>
+              <w:rPr>
+                <w:sz w:val="16"/>
+                <w:szCs w:val="16"/>
+                <w:u w:val="single"/>
+              </w:rPr>
+              <w:t>family + pharisees</w:t>
             </w:r>
           </w:p>
         </w:tc>
@@ -2287,113 +2312,6 @@
           <w:tcPr>
             <w:tcW w:w="4852" w:type="dxa"/>
           </w:tcPr>
-          <w:p>
-            <w:pPr>
-              <w:rPr>
-                <w:sz w:val="16"/>
-                <w:szCs w:val="16"/>
-              </w:rPr>
-            </w:pPr>
-            <w:r>
-              <w:rPr>
-                <w:sz w:val="16"/>
-                <w:szCs w:val="16"/>
-              </w:rPr>
-              <w:t xml:space="preserve">1. </w:t>
-            </w:r>
-            <w:r>
-              <w:rPr>
-                <w:sz w:val="16"/>
-                <w:szCs w:val="16"/>
-              </w:rPr>
-              <w:t xml:space="preserve">Image a </w:t>
-            </w:r>
-            <w:r>
-              <w:rPr>
-                <w:sz w:val="16"/>
-                <w:szCs w:val="16"/>
-              </w:rPr>
-              <w:t>good life</w:t>
-            </w:r>
-            <w:r>
-              <w:rPr>
-                <w:sz w:val="16"/>
-                <w:szCs w:val="16"/>
-              </w:rPr>
-              <w:t xml:space="preserve"> (read </w:t>
-            </w:r>
-            <w:r>
-              <w:rPr>
-                <w:sz w:val="16"/>
-                <w:szCs w:val="16"/>
-              </w:rPr>
-              <w:t>John &amp; Mark</w:t>
-            </w:r>
-            <w:r>
-              <w:rPr>
-                <w:sz w:val="16"/>
-                <w:szCs w:val="16"/>
-              </w:rPr>
-              <w:t>)</w:t>
-            </w:r>
-          </w:p>
-          <w:p>
-            <w:pPr>
-              <w:rPr>
-                <w:color w:val="EE0000"/>
-                <w:sz w:val="16"/>
-                <w:szCs w:val="16"/>
-              </w:rPr>
-            </w:pPr>
-            <w:r>
-              <w:rPr>
-                <w:color w:val="EE0000"/>
-                <w:sz w:val="16"/>
-                <w:szCs w:val="16"/>
-              </w:rPr>
-              <w:t xml:space="preserve">2. </w:t>
-            </w:r>
-            <w:r>
-              <w:rPr>
-                <w:color w:val="EE0000"/>
-                <w:sz w:val="16"/>
-                <w:szCs w:val="16"/>
-              </w:rPr>
-              <w:t>W</w:t>
-            </w:r>
-            <w:r>
-              <w:rPr>
-                <w:color w:val="EE0000"/>
-                <w:sz w:val="16"/>
-                <w:szCs w:val="16"/>
-              </w:rPr>
-              <w:t>e messed up bad! BCG</w:t>
-            </w:r>
-            <w:r>
-              <w:rPr>
-                <w:color w:val="EE0000"/>
-                <w:sz w:val="16"/>
-                <w:szCs w:val="16"/>
-              </w:rPr>
-              <w:t xml:space="preserve"> </w:t>
-            </w:r>
-            <w:r>
-              <w:rPr>
-                <w:color w:val="EE0000"/>
-                <w:sz w:val="16"/>
-                <w:szCs w:val="16"/>
-              </w:rPr>
-              <w:t>helicopter</w:t>
-            </w:r>
-            <w:r>
-              <w:rPr>
-                <w:color w:val="EE0000"/>
-                <w:sz w:val="16"/>
-                <w:szCs w:val="16"/>
-              </w:rPr>
-              <w:t xml:space="preserve"> humiliation.</w:t>
-            </w:r>
-          </w:p>
           <w:p>
             <w:pPr>
               <w:pStyle w:val="ListParagraph"/>
@@ -2412,15 +2330,108 @@
                 <w:sz w:val="16"/>
                 <w:szCs w:val="16"/>
               </w:rPr>
-              <w:t xml:space="preserve">But </w:t>
-            </w:r>
-            <w:proofErr w:type="gramStart"/>
-            <w:r>
-              <w:rPr>
-                <w:sz w:val="16"/>
-                <w:szCs w:val="16"/>
-              </w:rPr>
-              <w:t xml:space="preserve">didn’t </w:t>
+              <w:t xml:space="preserve">Reason 1: To </w:t>
+            </w:r>
+            <w:r>
+              <w:rPr>
+                <w:sz w:val="16"/>
+                <w:szCs w:val="16"/>
+                <w:u w:val="single"/>
+              </w:rPr>
+              <w:t>image</w:t>
+            </w:r>
+            <w:r>
+              <w:rPr>
+                <w:sz w:val="16"/>
+                <w:szCs w:val="16"/>
+              </w:rPr>
+              <w:t xml:space="preserve"> </w:t>
+            </w:r>
+            <w:r>
+              <w:rPr>
+                <w:sz w:val="16"/>
+                <w:szCs w:val="16"/>
+              </w:rPr>
+              <w:t xml:space="preserve">a good life </w:t>
+            </w:r>
+            <w:r>
+              <w:rPr>
+                <w:sz w:val="16"/>
+                <w:szCs w:val="16"/>
+              </w:rPr>
+              <w:t xml:space="preserve">for us </w:t>
+            </w:r>
+            <w:r>
+              <w:rPr>
+                <w:sz w:val="16"/>
+                <w:szCs w:val="16"/>
+              </w:rPr>
+              <w:t xml:space="preserve">(read John </w:t>
+            </w:r>
+            <w:r>
+              <w:rPr>
+                <w:sz w:val="16"/>
+                <w:szCs w:val="16"/>
+              </w:rPr>
+              <w:t>+</w:t>
+            </w:r>
+            <w:r>
+              <w:rPr>
+                <w:sz w:val="16"/>
+                <w:szCs w:val="16"/>
+              </w:rPr>
+              <w:t xml:space="preserve"> Mark)</w:t>
+            </w:r>
+          </w:p>
+          <w:p>
+            <w:pPr>
+              <w:pStyle w:val="ListParagraph"/>
+              <w:numPr>
+                <w:ilvl w:val="0"/>
+                <w:numId w:val="5"/>
+              </w:numPr>
+              <w:ind w:left="69" w:hanging="111"/>
+              <w:rPr>
+                <w:sz w:val="16"/>
+                <w:szCs w:val="16"/>
+              </w:rPr>
+            </w:pPr>
+            <w:r>
+              <w:rPr>
+                <w:color w:val="EE0000"/>
+                <w:sz w:val="16"/>
+                <w:szCs w:val="16"/>
+              </w:rPr>
+              <w:t xml:space="preserve">Reason 2: We </w:t>
+            </w:r>
+            <w:r>
+              <w:rPr>
+                <w:color w:val="EE0000"/>
+                <w:sz w:val="16"/>
+                <w:szCs w:val="16"/>
+              </w:rPr>
+              <w:t>messed up bad! BCG helicopter humiliation</w:t>
+            </w:r>
+          </w:p>
+          <w:p>
+            <w:pPr>
+              <w:pStyle w:val="ListParagraph"/>
+              <w:numPr>
+                <w:ilvl w:val="0"/>
+                <w:numId w:val="5"/>
+              </w:numPr>
+              <w:ind w:left="69" w:hanging="111"/>
+              <w:rPr>
+                <w:sz w:val="16"/>
+                <w:szCs w:val="16"/>
+              </w:rPr>
+            </w:pPr>
+            <w:r>
+              <w:rPr>
+                <w:sz w:val="16"/>
+                <w:szCs w:val="16"/>
+              </w:rPr>
+              <w:t xml:space="preserve">But didn’t </w:t>
             </w:r>
             <w:r>
               <w:rPr>
@@ -2434,15 +2445,7 @@
                 <w:sz w:val="16"/>
                 <w:szCs w:val="16"/>
               </w:rPr>
-              <w:t>ord</w:t>
-            </w:r>
-            <w:proofErr w:type="gramEnd"/>
-            <w:r>
-              <w:rPr>
-                <w:sz w:val="16"/>
-                <w:szCs w:val="16"/>
-              </w:rPr>
-              <w:t xml:space="preserve"> over us. He was </w:t>
+              <w:t xml:space="preserve">ord over us. He was </w:t>
             </w:r>
             <w:r>
               <w:rPr>
@@ -2611,7 +2614,23 @@
                 <w:sz w:val="16"/>
                 <w:szCs w:val="16"/>
               </w:rPr>
-              <w:t>Cross = extreme image</w:t>
+              <w:t xml:space="preserve">Cross = </w:t>
+            </w:r>
+            <w:r>
+              <w:rPr>
+                <w:b/>
+                <w:bCs/>
+                <w:sz w:val="16"/>
+                <w:szCs w:val="16"/>
+              </w:rPr>
+              <w:t>extreme</w:t>
+            </w:r>
+            <w:r>
+              <w:rPr>
+                <w:sz w:val="16"/>
+                <w:szCs w:val="16"/>
+              </w:rPr>
+              <w:t xml:space="preserve"> image</w:t>
             </w:r>
             <w:r>
               <w:rPr>
@@ -2672,21 +2691,14 @@
                 <w:sz w:val="16"/>
                 <w:szCs w:val="16"/>
               </w:rPr>
-              <w:t xml:space="preserve">Need to </w:t>
-            </w:r>
-            <w:r>
-              <w:rPr>
-                <w:sz w:val="16"/>
-                <w:szCs w:val="16"/>
-              </w:rPr>
-              <w:t xml:space="preserve">help and save </w:t>
-            </w:r>
-            <w:r>
-              <w:rPr>
-                <w:sz w:val="16"/>
-                <w:szCs w:val="16"/>
-              </w:rPr>
-              <w:t>you.</w:t>
+              <w:t xml:space="preserve">Femi, you need my help </w:t>
+            </w:r>
+            <w:r>
+              <w:rPr>
+                <w:sz w:val="16"/>
+                <w:szCs w:val="16"/>
+              </w:rPr>
+              <w:t>= fine…</w:t>
             </w:r>
           </w:p>
           <w:p>
@@ -2714,7 +2726,7 @@
                 <w:sz w:val="16"/>
                 <w:szCs w:val="16"/>
               </w:rPr>
-              <w:t>C</w:t>
+              <w:t>But c</w:t>
             </w:r>
             <w:r>
               <w:rPr>
@@ -2728,14 +2740,6 @@
               <w:rPr>
                 <w:sz w:val="16"/>
                 <w:szCs w:val="16"/>
-                <w:u w:val="single"/>
-              </w:rPr>
-              <w:t>?!</w:t>
-            </w:r>
-            <w:r>
-              <w:rPr>
-                <w:sz w:val="16"/>
-                <w:szCs w:val="16"/>
               </w:rPr>
               <w:t xml:space="preserve"> </w:t>
             </w:r>
@@ -2772,7 +2776,21 @@
                 <w:sz w:val="16"/>
                 <w:szCs w:val="16"/>
               </w:rPr>
-              <w:t xml:space="preserve">10-point plan. </w:t>
+              <w:t>10-point plan</w:t>
+            </w:r>
+            <w:r>
+              <w:rPr>
+                <w:sz w:val="16"/>
+                <w:szCs w:val="16"/>
+              </w:rPr>
+              <w:t xml:space="preserve"> instead?</w:t>
+            </w:r>
+            <w:r>
+              <w:rPr>
+                <w:sz w:val="16"/>
+                <w:szCs w:val="16"/>
+              </w:rPr>
+              <w:t xml:space="preserve"> </w:t>
             </w:r>
           </w:p>
           <w:p>
@@ -2793,7 +2811,14 @@
                 <w:sz w:val="16"/>
                 <w:szCs w:val="16"/>
               </w:rPr>
-              <w:t xml:space="preserve">Walks me through Delta </w:t>
+              <w:t xml:space="preserve">Walks through </w:t>
+            </w:r>
+            <w:r>
+              <w:rPr>
+                <w:sz w:val="16"/>
+                <w:szCs w:val="16"/>
+              </w:rPr>
+              <w:t xml:space="preserve">gap </w:t>
             </w:r>
             <w:r>
               <w:rPr>
@@ -2814,7 +2839,42 @@
                 <w:sz w:val="16"/>
                 <w:szCs w:val="16"/>
               </w:rPr>
-              <w:t xml:space="preserve">only God can fill that. </w:t>
+              <w:t xml:space="preserve">dark wiki </w:t>
+            </w:r>
+            <w:r>
+              <w:rPr>
+                <w:sz w:val="16"/>
+                <w:szCs w:val="16"/>
+              </w:rPr>
+              <w:t xml:space="preserve">vs. </w:t>
+            </w:r>
+            <w:r>
+              <w:rPr>
+                <w:sz w:val="16"/>
+                <w:szCs w:val="16"/>
+              </w:rPr>
+              <w:t xml:space="preserve">New </w:t>
+            </w:r>
+            <w:r>
+              <w:rPr>
+                <w:sz w:val="16"/>
+                <w:szCs w:val="16"/>
+              </w:rPr>
+              <w:t>self</w:t>
+            </w:r>
+            <w:r>
+              <w:rPr>
+                <w:sz w:val="16"/>
+                <w:szCs w:val="16"/>
+              </w:rPr>
+              <w:t xml:space="preserve">. Only </w:t>
+            </w:r>
+            <w:r>
+              <w:rPr>
+                <w:sz w:val="16"/>
+                <w:szCs w:val="16"/>
+              </w:rPr>
+              <w:t xml:space="preserve">God can fill. </w:t>
             </w:r>
           </w:p>
           <w:p>
@@ -2832,6 +2892,7 @@
             </w:pPr>
             <w:r>
               <w:rPr>
+                <w:color w:val="EE0000"/>
                 <w:sz w:val="16"/>
                 <w:szCs w:val="16"/>
               </w:rPr>
@@ -2841,6 +2902,7 @@
               <w:rPr>
                 <w:i/>
                 <w:iCs/>
+                <w:color w:val="EE0000"/>
                 <w:sz w:val="16"/>
                 <w:szCs w:val="16"/>
               </w:rPr>
@@ -2848,6 +2910,7 @@
             </w:r>
             <w:r>
               <w:rPr>
+                <w:color w:val="EE0000"/>
                 <w:sz w:val="16"/>
                 <w:szCs w:val="16"/>
               </w:rPr>
@@ -2855,6 +2918,7 @@
             </w:r>
             <w:r>
               <w:rPr>
+                <w:color w:val="EE0000"/>
                 <w:sz w:val="16"/>
                 <w:szCs w:val="16"/>
               </w:rPr>
@@ -2864,6 +2928,7 @@
               <w:rPr>
                 <w:i/>
                 <w:iCs/>
+                <w:color w:val="EE0000"/>
                 <w:sz w:val="16"/>
                 <w:szCs w:val="16"/>
               </w:rPr>
@@ -2871,6 +2936,7 @@
             </w:r>
             <w:r>
               <w:rPr>
+                <w:color w:val="EE0000"/>
                 <w:sz w:val="16"/>
                 <w:szCs w:val="16"/>
               </w:rPr>
@@ -2878,6 +2944,7 @@
             </w:r>
             <w:r>
               <w:rPr>
+                <w:color w:val="EE0000"/>
                 <w:sz w:val="16"/>
                 <w:szCs w:val="16"/>
               </w:rPr>
@@ -2885,6 +2952,7 @@
             </w:r>
             <w:r>
               <w:rPr>
+                <w:color w:val="EE0000"/>
                 <w:sz w:val="16"/>
                 <w:szCs w:val="16"/>
               </w:rPr>
@@ -2892,10 +2960,11 @@
             </w:r>
             <w:r>
               <w:rPr>
-                <w:sz w:val="16"/>
-                <w:szCs w:val="16"/>
-              </w:rPr>
-              <w:t xml:space="preserve">God is and his goals </w:t>
+                <w:color w:val="EE0000"/>
+                <w:sz w:val="16"/>
+                <w:szCs w:val="16"/>
+              </w:rPr>
+              <w:t>God is and his goals</w:t>
             </w:r>
           </w:p>
         </w:tc>
@@ -2945,31 +3014,7 @@
                 <w:sz w:val="16"/>
                 <w:szCs w:val="16"/>
               </w:rPr>
-              <w:t xml:space="preserve">he has now reconciled in his body of flesh by his death, </w:t>
-            </w:r>
-            <w:proofErr w:type="gramStart"/>
-            <w:r>
-              <w:rPr>
-                <w:b/>
-                <w:bCs/>
-                <w:i/>
-                <w:iCs/>
-                <w:sz w:val="16"/>
-                <w:szCs w:val="16"/>
-              </w:rPr>
-              <w:t>in order to</w:t>
-            </w:r>
-            <w:proofErr w:type="gramEnd"/>
-            <w:r>
-              <w:rPr>
-                <w:b/>
-                <w:bCs/>
-                <w:i/>
-                <w:iCs/>
-                <w:sz w:val="16"/>
-                <w:szCs w:val="16"/>
-              </w:rPr>
-              <w:t xml:space="preserve"> present you holy and blameless and above reproach before him</w:t>
+              <w:t>he has now reconciled in his body of flesh by his death, in order to present you holy and blameless and above reproach before him</w:t>
             </w:r>
           </w:p>
         </w:tc>
@@ -3273,31 +3318,7 @@
                 <w:sz w:val="16"/>
                 <w:szCs w:val="16"/>
               </w:rPr>
-              <w:t xml:space="preserve">He has now reconciled in his body of flesh by his death, </w:t>
-            </w:r>
-            <w:proofErr w:type="gramStart"/>
-            <w:r>
-              <w:rPr>
-                <w:b/>
-                <w:bCs/>
-                <w:i/>
-                <w:iCs/>
-                <w:sz w:val="16"/>
-                <w:szCs w:val="16"/>
-              </w:rPr>
-              <w:t>in order to</w:t>
-            </w:r>
-            <w:proofErr w:type="gramEnd"/>
-            <w:r>
-              <w:rPr>
-                <w:b/>
-                <w:bCs/>
-                <w:i/>
-                <w:iCs/>
-                <w:sz w:val="16"/>
-                <w:szCs w:val="16"/>
-              </w:rPr>
-              <w:t xml:space="preserve"> present you holy and blameless and above reproach before him</w:t>
+              <w:t>He has now reconciled in his body of flesh by his death, in order to present you holy and blameless and above reproach before him</w:t>
             </w:r>
           </w:p>
         </w:tc>
@@ -3601,23 +3622,7 @@
                 <w:sz w:val="16"/>
                 <w:szCs w:val="16"/>
               </w:rPr>
-              <w:t xml:space="preserve">Carol </w:t>
-            </w:r>
-            <w:proofErr w:type="gramStart"/>
-            <w:r>
-              <w:rPr>
-                <w:sz w:val="16"/>
-                <w:szCs w:val="16"/>
-              </w:rPr>
-              <w:t>Dweck</w:t>
-            </w:r>
-            <w:proofErr w:type="gramEnd"/>
-            <w:r>
-              <w:rPr>
-                <w:sz w:val="16"/>
-                <w:szCs w:val="16"/>
-              </w:rPr>
-              <w:t xml:space="preserve"> growth mindset. </w:t>
+              <w:t xml:space="preserve">Carol Dweck growth mindset. </w:t>
             </w:r>
             <w:r>
               <w:rPr>
@@ -4282,7 +4287,23 @@
                 <w:sz w:val="16"/>
                 <w:szCs w:val="16"/>
               </w:rPr>
-              <w:t xml:space="preserve">Because through the </w:t>
+              <w:t xml:space="preserve">Because </w:t>
+            </w:r>
+            <w:r>
+              <w:rPr>
+                <w:color w:val="EE0000"/>
+                <w:sz w:val="16"/>
+                <w:szCs w:val="16"/>
+              </w:rPr>
+              <w:t xml:space="preserve">along with </w:t>
+            </w:r>
+            <w:r>
+              <w:rPr>
+                <w:color w:val="EE0000"/>
+                <w:sz w:val="16"/>
+                <w:szCs w:val="16"/>
+              </w:rPr>
+              <w:t xml:space="preserve">the </w:t>
             </w:r>
             <w:r>
               <w:rPr>
@@ -4314,8 +4335,38 @@
                 <w:sz w:val="16"/>
                 <w:szCs w:val="16"/>
               </w:rPr>
-              <w:t xml:space="preserve">Father always: </w:t>
-            </w:r>
+              <w:t xml:space="preserve">Father </w:t>
+            </w:r>
+            <w:r>
+              <w:rPr>
+                <w:color w:val="EE0000"/>
+                <w:sz w:val="16"/>
+                <w:szCs w:val="16"/>
+              </w:rPr>
+              <w:t xml:space="preserve">+ </w:t>
+            </w:r>
+            <w:r>
+              <w:rPr>
+                <w:color w:val="EE0000"/>
+                <w:sz w:val="16"/>
+                <w:szCs w:val="16"/>
+              </w:rPr>
+              <w:t xml:space="preserve">always: </w:t>
+            </w:r>
+          </w:p>
+          <w:p>
+            <w:pPr>
+              <w:pStyle w:val="ListParagraph"/>
+              <w:numPr>
+                <w:ilvl w:val="0"/>
+                <w:numId w:val="5"/>
+              </w:numPr>
+              <w:ind w:left="69" w:hanging="111"/>
+              <w:rPr>
+                <w:sz w:val="16"/>
+                <w:szCs w:val="16"/>
+              </w:rPr>
+            </w:pPr>
             <w:r>
               <w:rPr>
                 <w:color w:val="EE0000"/>
@@ -4335,6 +4386,8 @@
             </w:r>
             <w:r>
               <w:rPr>
+                <w:b/>
+                <w:bCs/>
                 <w:color w:val="EE0000"/>
                 <w:sz w:val="16"/>
                 <w:szCs w:val="16"/>
@@ -4376,18 +4429,7 @@
                 <w:sz w:val="16"/>
                 <w:szCs w:val="16"/>
               </w:rPr>
-              <w:t>John 17:22</w:t>
-            </w:r>
-            <w:r>
-              <w:rPr>
-                <w:b/>
-                <w:bCs/>
-                <w:i/>
-                <w:iCs/>
-                <w:sz w:val="16"/>
-                <w:szCs w:val="16"/>
-              </w:rPr>
-              <w:t>_</w:t>
+              <w:t>John 17:22_</w:t>
             </w:r>
             <w:r>
               <w:rPr>
@@ -4519,7 +4561,49 @@
                 <w:sz w:val="16"/>
                 <w:szCs w:val="16"/>
               </w:rPr>
-              <w:t>Collectively, church = body, Christ = head.</w:t>
+              <w:t>Collective</w:t>
+            </w:r>
+            <w:r>
+              <w:rPr>
+                <w:sz w:val="16"/>
+                <w:szCs w:val="16"/>
+              </w:rPr>
+              <w:t xml:space="preserve"> = </w:t>
+            </w:r>
+            <w:r>
+              <w:rPr>
+                <w:sz w:val="16"/>
+                <w:szCs w:val="16"/>
+              </w:rPr>
+              <w:t>church = body</w:t>
+            </w:r>
+            <w:r>
+              <w:rPr>
+                <w:sz w:val="16"/>
+                <w:szCs w:val="16"/>
+              </w:rPr>
+              <w:t xml:space="preserve"> </w:t>
+            </w:r>
+            <w:r>
+              <w:rPr>
+                <w:sz w:val="16"/>
+                <w:szCs w:val="16"/>
+              </w:rPr>
+              <w:sym w:font="Wingdings" w:char="F0E0"/>
+            </w:r>
+            <w:r>
+              <w:rPr>
+                <w:sz w:val="16"/>
+                <w:szCs w:val="16"/>
+              </w:rPr>
+              <w:t xml:space="preserve"> </w:t>
+            </w:r>
+            <w:r>
+              <w:rPr>
+                <w:sz w:val="16"/>
+                <w:szCs w:val="16"/>
+              </w:rPr>
+              <w:t>Christ = head.</w:t>
             </w:r>
           </w:p>
           <w:p>
@@ -4540,7 +4624,21 @@
                 <w:sz w:val="16"/>
                 <w:szCs w:val="16"/>
               </w:rPr>
-              <w:t>We image the invisible Christ to world!</w:t>
+              <w:t xml:space="preserve">We image </w:t>
+            </w:r>
+            <w:r>
+              <w:rPr>
+                <w:sz w:val="16"/>
+                <w:szCs w:val="16"/>
+              </w:rPr>
+              <w:t xml:space="preserve">(body) </w:t>
+            </w:r>
+            <w:r>
+              <w:rPr>
+                <w:sz w:val="16"/>
+                <w:szCs w:val="16"/>
+              </w:rPr>
+              <w:t>invisible Christ to world!</w:t>
             </w:r>
           </w:p>
           <w:p>
@@ -4576,7 +4674,23 @@
                 <w:sz w:val="16"/>
                 <w:szCs w:val="16"/>
               </w:rPr>
-              <w:t xml:space="preserve"> qualify with all our flaws?</w:t>
+              <w:t xml:space="preserve"> </w:t>
+            </w:r>
+            <w:r>
+              <w:rPr>
+                <w:b/>
+                <w:bCs/>
+                <w:sz w:val="16"/>
+                <w:szCs w:val="16"/>
+              </w:rPr>
+              <w:t>qualify with all our flaws</w:t>
+            </w:r>
+            <w:r>
+              <w:rPr>
+                <w:sz w:val="16"/>
+                <w:szCs w:val="16"/>
+              </w:rPr>
+              <w:t>?</w:t>
             </w:r>
           </w:p>
         </w:tc>
@@ -4603,7 +4717,35 @@
                 <w:sz w:val="16"/>
                 <w:szCs w:val="16"/>
               </w:rPr>
-              <w:t xml:space="preserve">A mystery to me. </w:t>
+              <w:t xml:space="preserve">Mostly, a </w:t>
+            </w:r>
+            <w:r>
+              <w:rPr>
+                <w:sz w:val="16"/>
+                <w:szCs w:val="16"/>
+              </w:rPr>
+              <w:t>mystery to me</w:t>
+            </w:r>
+            <w:r>
+              <w:rPr>
+                <w:sz w:val="16"/>
+                <w:szCs w:val="16"/>
+              </w:rPr>
+              <w:t>…</w:t>
+            </w:r>
+            <w:r>
+              <w:rPr>
+                <w:sz w:val="16"/>
+                <w:szCs w:val="16"/>
+              </w:rPr>
+              <w:t xml:space="preserve"> but</w:t>
+            </w:r>
+            <w:r>
+              <w:rPr>
+                <w:sz w:val="16"/>
+                <w:szCs w:val="16"/>
+              </w:rPr>
+              <w:t>…</w:t>
             </w:r>
           </w:p>
           <w:p>
@@ -4687,7 +4829,7 @@
                 <w:sz w:val="16"/>
                 <w:szCs w:val="16"/>
               </w:rPr>
-              <w:t xml:space="preserve"> even in flaws </w:t>
+              <w:t xml:space="preserve"> flaws </w:t>
             </w:r>
             <w:r>
               <w:rPr>
@@ -4701,7 +4843,28 @@
                 <w:sz w:val="16"/>
                 <w:szCs w:val="16"/>
               </w:rPr>
-              <w:t>image of invisible God.</w:t>
+              <w:t xml:space="preserve">clearest </w:t>
+            </w:r>
+            <w:r>
+              <w:rPr>
+                <w:sz w:val="16"/>
+                <w:szCs w:val="16"/>
+              </w:rPr>
+              <w:t>image</w:t>
+            </w:r>
+            <w:r>
+              <w:rPr>
+                <w:sz w:val="16"/>
+                <w:szCs w:val="16"/>
+              </w:rPr>
+              <w:t>/evidence</w:t>
+            </w:r>
+            <w:r>
+              <w:rPr>
+                <w:sz w:val="16"/>
+                <w:szCs w:val="16"/>
+              </w:rPr>
+              <w:t xml:space="preserve"> of invisible God.</w:t>
             </w:r>
           </w:p>
         </w:tc>
@@ -4833,17 +4996,26 @@
             </w:pPr>
             <w:r>
               <w:rPr>
-                <w:sz w:val="16"/>
-                <w:szCs w:val="16"/>
-              </w:rPr>
-              <w:t xml:space="preserve">The big ‘IF’! </w:t>
-            </w:r>
-            <w:r>
-              <w:rPr>
-                <w:sz w:val="16"/>
-                <w:szCs w:val="16"/>
-              </w:rPr>
-              <w:t>(after awesome promises)</w:t>
+                <w:b/>
+                <w:bCs/>
+                <w:sz w:val="16"/>
+                <w:szCs w:val="16"/>
+              </w:rPr>
+              <w:t>IF</w:t>
+            </w:r>
+            <w:r>
+              <w:rPr>
+                <w:sz w:val="16"/>
+                <w:szCs w:val="16"/>
+              </w:rPr>
+              <w:t xml:space="preserve">  = massive letdown after hype</w:t>
+            </w:r>
+            <w:r>
+              <w:rPr>
+                <w:sz w:val="16"/>
+                <w:szCs w:val="16"/>
+              </w:rPr>
+              <w:t>?</w:t>
             </w:r>
           </w:p>
         </w:tc>
@@ -4870,21 +5042,28 @@
                 <w:sz w:val="16"/>
                 <w:szCs w:val="16"/>
               </w:rPr>
-              <w:t xml:space="preserve">Responsibility = </w:t>
-            </w:r>
-            <w:r>
-              <w:rPr>
-                <w:sz w:val="16"/>
-                <w:szCs w:val="16"/>
-              </w:rPr>
-              <w:t>deal-</w:t>
-            </w:r>
-            <w:r>
-              <w:rPr>
-                <w:sz w:val="16"/>
-                <w:szCs w:val="16"/>
-              </w:rPr>
-              <w:t>breaker?</w:t>
+              <w:t>If r</w:t>
+            </w:r>
+            <w:r>
+              <w:rPr>
+                <w:sz w:val="16"/>
+                <w:szCs w:val="16"/>
+              </w:rPr>
+              <w:t xml:space="preserve">esponsibility = </w:t>
+            </w:r>
+            <w:r>
+              <w:rPr>
+                <w:sz w:val="16"/>
+                <w:szCs w:val="16"/>
+              </w:rPr>
+              <w:t xml:space="preserve">letdown </w:t>
+            </w:r>
+            <w:r>
+              <w:rPr>
+                <w:sz w:val="16"/>
+                <w:szCs w:val="16"/>
+              </w:rPr>
+              <w:sym w:font="Wingdings" w:char="F0E0"/>
             </w:r>
             <w:r>
               <w:rPr>
@@ -4898,42 +5077,14 @@
                 <w:sz w:val="16"/>
                 <w:szCs w:val="16"/>
               </w:rPr>
-              <w:sym w:font="Wingdings" w:char="F0E0"/>
-            </w:r>
-            <w:r>
-              <w:rPr>
-                <w:sz w:val="16"/>
-                <w:szCs w:val="16"/>
-              </w:rPr>
-              <w:t xml:space="preserve"> </w:t>
-            </w:r>
-            <w:r>
-              <w:rPr>
-                <w:sz w:val="16"/>
-                <w:szCs w:val="16"/>
-              </w:rPr>
-              <w:t xml:space="preserve">3 </w:t>
-            </w:r>
-            <w:r>
-              <w:rPr>
-                <w:sz w:val="16"/>
-                <w:szCs w:val="16"/>
-              </w:rPr>
-              <w:t>misconceptio</w:t>
-            </w:r>
-            <w:r>
-              <w:rPr>
-                <w:sz w:val="16"/>
-                <w:szCs w:val="16"/>
-              </w:rPr>
-              <w:t xml:space="preserve">ns: </w:t>
-            </w:r>
-            <w:r>
-              <w:rPr>
-                <w:sz w:val="16"/>
-                <w:szCs w:val="16"/>
-              </w:rPr>
-              <w:t>OR/THEN/WITH</w:t>
+              <w:t>misunderstood co-inherence</w:t>
+            </w:r>
+            <w:r>
+              <w:rPr>
+                <w:sz w:val="16"/>
+                <w:szCs w:val="16"/>
+              </w:rPr>
+              <w:t>?</w:t>
             </w:r>
           </w:p>
           <w:p>
@@ -4954,35 +5105,7 @@
                 <w:sz w:val="16"/>
                 <w:szCs w:val="16"/>
               </w:rPr>
-              <w:t xml:space="preserve">Correct: IN! </w:t>
-            </w:r>
-            <w:r>
-              <w:rPr>
-                <w:sz w:val="16"/>
-                <w:szCs w:val="16"/>
-              </w:rPr>
-              <w:t xml:space="preserve">Christ is </w:t>
-            </w:r>
-            <w:r>
-              <w:rPr>
-                <w:sz w:val="16"/>
-                <w:szCs w:val="16"/>
-              </w:rPr>
-              <w:t xml:space="preserve">us continually </w:t>
-            </w:r>
-            <w:r>
-              <w:rPr>
-                <w:sz w:val="16"/>
-                <w:szCs w:val="16"/>
-              </w:rPr>
-              <w:t xml:space="preserve">renewing </w:t>
-            </w:r>
-            <w:r>
-              <w:rPr>
-                <w:sz w:val="16"/>
-                <w:szCs w:val="16"/>
-              </w:rPr>
-              <w:t>the faith we need to continue in the faith</w:t>
+              <w:t xml:space="preserve">3 misconception = </w:t>
             </w:r>
             <w:r>
               <w:rPr>
@@ -4996,7 +5119,7 @@
                 <w:sz w:val="16"/>
                 <w:szCs w:val="16"/>
               </w:rPr>
-              <w:sym w:font="Wingdings" w:char="F0E0"/>
+              <w:t>OR</w:t>
             </w:r>
             <w:r>
               <w:rPr>
@@ -5010,13 +5133,6 @@
                 <w:sz w:val="16"/>
                 <w:szCs w:val="16"/>
               </w:rPr>
-              <w:t>No contradiction</w:t>
-            </w:r>
-            <w:r>
-              <w:rPr>
-                <w:sz w:val="16"/>
-                <w:szCs w:val="16"/>
-              </w:rPr>
               <w:t>/</w:t>
             </w:r>
             <w:r>
@@ -5024,7 +5140,42 @@
                 <w:sz w:val="16"/>
                 <w:szCs w:val="16"/>
               </w:rPr>
-              <w:t>competition, just unity.</w:t>
+              <w:t xml:space="preserve"> </w:t>
+            </w:r>
+            <w:r>
+              <w:rPr>
+                <w:sz w:val="16"/>
+                <w:szCs w:val="16"/>
+              </w:rPr>
+              <w:t>THEN</w:t>
+            </w:r>
+            <w:r>
+              <w:rPr>
+                <w:sz w:val="16"/>
+                <w:szCs w:val="16"/>
+              </w:rPr>
+              <w:t xml:space="preserve"> </w:t>
+            </w:r>
+            <w:r>
+              <w:rPr>
+                <w:sz w:val="16"/>
+                <w:szCs w:val="16"/>
+              </w:rPr>
+              <w:t>/</w:t>
+            </w:r>
+            <w:r>
+              <w:rPr>
+                <w:sz w:val="16"/>
+                <w:szCs w:val="16"/>
+              </w:rPr>
+              <w:t xml:space="preserve"> </w:t>
+            </w:r>
+            <w:r>
+              <w:rPr>
+                <w:sz w:val="16"/>
+                <w:szCs w:val="16"/>
+              </w:rPr>
+              <w:t>WITH</w:t>
             </w:r>
           </w:p>
           <w:p>
@@ -5042,29 +5193,163 @@
             </w:pPr>
             <w:r>
               <w:rPr>
-                <w:color w:val="EE0000"/>
-                <w:sz w:val="16"/>
-                <w:szCs w:val="16"/>
-              </w:rPr>
-              <w:t xml:space="preserve">Scripture </w:t>
-            </w:r>
-            <w:proofErr w:type="spellStart"/>
-            <w:r>
-              <w:rPr>
-                <w:color w:val="EE0000"/>
-                <w:sz w:val="16"/>
-                <w:szCs w:val="16"/>
-              </w:rPr>
-              <w:t>C at</w:t>
-            </w:r>
-            <w:proofErr w:type="spellEnd"/>
-            <w:r>
-              <w:rPr>
-                <w:color w:val="EE0000"/>
-                <w:sz w:val="16"/>
-                <w:szCs w:val="16"/>
-              </w:rPr>
-              <w:t xml:space="preserve"> end.</w:t>
+                <w:sz w:val="16"/>
+                <w:szCs w:val="16"/>
+              </w:rPr>
+              <w:t>Correct</w:t>
+            </w:r>
+            <w:r>
+              <w:rPr>
+                <w:sz w:val="16"/>
+                <w:szCs w:val="16"/>
+              </w:rPr>
+              <w:t xml:space="preserve"> = </w:t>
+            </w:r>
+            <w:r>
+              <w:rPr>
+                <w:b/>
+                <w:bCs/>
+                <w:sz w:val="16"/>
+                <w:szCs w:val="16"/>
+              </w:rPr>
+              <w:t>IN</w:t>
+            </w:r>
+            <w:r>
+              <w:rPr>
+                <w:sz w:val="16"/>
+                <w:szCs w:val="16"/>
+              </w:rPr>
+              <w:t xml:space="preserve">! </w:t>
+            </w:r>
+            <w:r>
+              <w:rPr>
+                <w:sz w:val="16"/>
+                <w:szCs w:val="16"/>
+              </w:rPr>
+              <w:t xml:space="preserve">Christ </w:t>
+            </w:r>
+            <w:r>
+              <w:rPr>
+                <w:b/>
+                <w:bCs/>
+                <w:sz w:val="16"/>
+                <w:szCs w:val="16"/>
+              </w:rPr>
+              <w:t>IN</w:t>
+            </w:r>
+            <w:r>
+              <w:rPr>
+                <w:sz w:val="16"/>
+                <w:szCs w:val="16"/>
+              </w:rPr>
+              <w:t xml:space="preserve"> </w:t>
+            </w:r>
+            <w:r>
+              <w:rPr>
+                <w:sz w:val="16"/>
+                <w:szCs w:val="16"/>
+              </w:rPr>
+              <w:t>us</w:t>
+            </w:r>
+            <w:r>
+              <w:rPr>
+                <w:sz w:val="16"/>
+                <w:szCs w:val="16"/>
+              </w:rPr>
+              <w:t xml:space="preserve">… </w:t>
+            </w:r>
+            <w:r>
+              <w:rPr>
+                <w:sz w:val="16"/>
+                <w:szCs w:val="16"/>
+              </w:rPr>
+              <w:t xml:space="preserve">continually </w:t>
+            </w:r>
+            <w:r>
+              <w:rPr>
+                <w:sz w:val="16"/>
+                <w:szCs w:val="16"/>
+              </w:rPr>
+              <w:t xml:space="preserve">renewing </w:t>
+            </w:r>
+            <w:r>
+              <w:rPr>
+                <w:sz w:val="16"/>
+                <w:szCs w:val="16"/>
+              </w:rPr>
+              <w:t>faith we need to continue in the faith</w:t>
+            </w:r>
+            <w:r>
+              <w:rPr>
+                <w:sz w:val="16"/>
+                <w:szCs w:val="16"/>
+              </w:rPr>
+              <w:t xml:space="preserve"> </w:t>
+            </w:r>
+            <w:r>
+              <w:rPr>
+                <w:sz w:val="16"/>
+                <w:szCs w:val="16"/>
+              </w:rPr>
+              <w:sym w:font="Wingdings" w:char="F0E0"/>
+            </w:r>
+            <w:r>
+              <w:rPr>
+                <w:sz w:val="16"/>
+                <w:szCs w:val="16"/>
+              </w:rPr>
+              <w:t xml:space="preserve"> </w:t>
+            </w:r>
+            <w:r>
+              <w:rPr>
+                <w:sz w:val="16"/>
+                <w:szCs w:val="16"/>
+              </w:rPr>
+              <w:t>No contradiction</w:t>
+            </w:r>
+            <w:r>
+              <w:rPr>
+                <w:sz w:val="16"/>
+                <w:szCs w:val="16"/>
+              </w:rPr>
+              <w:t>/</w:t>
+            </w:r>
+            <w:r>
+              <w:rPr>
+                <w:sz w:val="16"/>
+                <w:szCs w:val="16"/>
+              </w:rPr>
+              <w:t>competition, just unity.</w:t>
+            </w:r>
+          </w:p>
+          <w:p>
+            <w:pPr>
+              <w:pStyle w:val="ListParagraph"/>
+              <w:numPr>
+                <w:ilvl w:val="0"/>
+                <w:numId w:val="5"/>
+              </w:numPr>
+              <w:ind w:left="69" w:hanging="111"/>
+              <w:rPr>
+                <w:sz w:val="16"/>
+                <w:szCs w:val="16"/>
+              </w:rPr>
+            </w:pPr>
+            <w:r>
+              <w:rPr>
+                <w:color w:val="EE0000"/>
+                <w:sz w:val="16"/>
+                <w:szCs w:val="16"/>
+              </w:rPr>
+              <w:t xml:space="preserve">Read scripture </w:t>
+            </w:r>
+            <w:r>
+              <w:rPr>
+                <w:color w:val="EE0000"/>
+                <w:sz w:val="16"/>
+                <w:szCs w:val="16"/>
+              </w:rPr>
+              <w:t>after above</w:t>
             </w:r>
           </w:p>
         </w:tc>
@@ -5206,55 +5491,7 @@
                 <w:sz w:val="16"/>
                 <w:szCs w:val="16"/>
               </w:rPr>
-              <w:t xml:space="preserve">In my </w:t>
-            </w:r>
-            <w:proofErr w:type="gramStart"/>
-            <w:r>
-              <w:rPr>
-                <w:b/>
-                <w:bCs/>
-                <w:i/>
-                <w:iCs/>
-                <w:sz w:val="16"/>
-                <w:szCs w:val="16"/>
-              </w:rPr>
-              <w:t>Father's</w:t>
-            </w:r>
-            <w:proofErr w:type="gramEnd"/>
-            <w:r>
-              <w:rPr>
-                <w:b/>
-                <w:bCs/>
-                <w:i/>
-                <w:iCs/>
-                <w:sz w:val="16"/>
-                <w:szCs w:val="16"/>
-              </w:rPr>
-              <w:t xml:space="preserve"> house are many rooms. If it were not so, would I have told you that I </w:t>
-            </w:r>
-            <w:proofErr w:type="gramStart"/>
-            <w:r>
-              <w:rPr>
-                <w:b/>
-                <w:bCs/>
-                <w:i/>
-                <w:iCs/>
-                <w:sz w:val="16"/>
-                <w:szCs w:val="16"/>
-              </w:rPr>
-              <w:t>go</w:t>
-            </w:r>
-            <w:proofErr w:type="gramEnd"/>
-            <w:r>
-              <w:rPr>
-                <w:b/>
-                <w:bCs/>
-                <w:i/>
-                <w:iCs/>
-                <w:sz w:val="16"/>
-                <w:szCs w:val="16"/>
-              </w:rPr>
-              <w:t xml:space="preserve"> to prepare a place for you?</w:t>
+              <w:t>In my Father's house are many rooms. If it were not so, would I have told you that I go to prepare a place for you?</w:t>
             </w:r>
           </w:p>
         </w:tc>
@@ -5280,14 +5517,21 @@
                 <w:sz w:val="16"/>
                 <w:szCs w:val="16"/>
               </w:rPr>
-              <w:t xml:space="preserve">Final question: </w:t>
-            </w:r>
-            <w:r>
-              <w:rPr>
-                <w:sz w:val="16"/>
-                <w:szCs w:val="16"/>
-              </w:rPr>
-              <w:t xml:space="preserve">Where does the gospel end? </w:t>
+              <w:t>Final question</w:t>
+            </w:r>
+            <w:r>
+              <w:rPr>
+                <w:sz w:val="16"/>
+                <w:szCs w:val="16"/>
+              </w:rPr>
+              <w:t xml:space="preserve"> = where </w:t>
+            </w:r>
+            <w:r>
+              <w:rPr>
+                <w:sz w:val="16"/>
+                <w:szCs w:val="16"/>
+              </w:rPr>
+              <w:t>does gospel end?</w:t>
             </w:r>
           </w:p>
           <w:p>
@@ -5308,10 +5552,26 @@
                 <w:sz w:val="16"/>
                 <w:szCs w:val="16"/>
               </w:rPr>
-              <w:t xml:space="preserve">Don’t mean temporally, but </w:t>
-            </w:r>
-            <w:r>
-              <w:rPr>
+              <w:t xml:space="preserve">…don’t ask </w:t>
+            </w:r>
+            <w:r>
+              <w:rPr>
+                <w:sz w:val="16"/>
+                <w:szCs w:val="16"/>
+              </w:rPr>
+              <w:t xml:space="preserve">this </w:t>
+            </w:r>
+            <w:r>
+              <w:rPr>
+                <w:sz w:val="16"/>
+                <w:szCs w:val="16"/>
+              </w:rPr>
+              <w:t xml:space="preserve">temporally, but </w:t>
+            </w:r>
+            <w:r>
+              <w:rPr>
+                <w:b/>
+                <w:bCs/>
                 <w:sz w:val="16"/>
                 <w:szCs w:val="16"/>
                 <w:u w:val="single"/>
@@ -5320,10 +5580,13 @@
             </w:r>
             <w:r>
               <w:rPr>
-                <w:sz w:val="16"/>
-                <w:szCs w:val="16"/>
-              </w:rPr>
-              <w:t>?</w:t>
+                <w:b/>
+                <w:bCs/>
+                <w:sz w:val="16"/>
+                <w:szCs w:val="16"/>
+                <w:u w:val="single"/>
+              </w:rPr>
+              <w:t>!</w:t>
             </w:r>
           </w:p>
           <w:p>
@@ -5362,6 +5625,8 @@
             </w:r>
             <w:r>
               <w:rPr>
+                <w:b/>
+                <w:bCs/>
                 <w:sz w:val="16"/>
                 <w:szCs w:val="16"/>
                 <w:u w:val="single"/>
@@ -5380,7 +5645,7 @@
                 <w:sz w:val="16"/>
                 <w:szCs w:val="16"/>
               </w:rPr>
-              <w:t xml:space="preserve">All who want to, </w:t>
+              <w:t xml:space="preserve">All who want, </w:t>
             </w:r>
             <w:r>
               <w:rPr>
@@ -5524,21 +5789,12 @@
               </w:rPr>
               <w:t>-</w:t>
             </w:r>
-            <w:proofErr w:type="spellStart"/>
-            <w:r>
-              <w:rPr>
-                <w:sz w:val="16"/>
-                <w:szCs w:val="16"/>
-              </w:rPr>
-              <w:t>ination</w:t>
-            </w:r>
-            <w:proofErr w:type="spellEnd"/>
-            <w:r>
-              <w:rPr>
-                <w:sz w:val="16"/>
-                <w:szCs w:val="16"/>
-              </w:rPr>
-              <w:t xml:space="preserve"> + words + silence + hearts + </w:t>
+            <w:r>
+              <w:rPr>
+                <w:sz w:val="16"/>
+                <w:szCs w:val="16"/>
+              </w:rPr>
+              <w:t xml:space="preserve">ination + word + silence + hearts + </w:t>
             </w:r>
             <w:r>
               <w:rPr>

</xml_diff>